<commit_message>
docs(acpos): close batch-02 consumer contract gaps
</commit_message>
<xml_diff>
--- a/ACPOS_SOC-01_社群發布_Mother_Basic_Design_OPTIMIZED.docx
+++ b/ACPOS_SOC-01_社群發布_Mother_Basic_Design_OPTIMIZED.docx
@@ -24554,8 +24554,634 @@
         <w:t>The exact control denominator above is the only construction denominator for this page. Components/fields/visual IDs are not counted as additional controls. Existing source UIDs are preserved. A control classified UI_LOCAL_EXACT MUST NOT create a server write. A control classified SPEC_EXACT_RUNTIME_BLOCKED / NOT_EXECUTED MUST remain disabled or fail-closed until its runtime evidence exists.</w:t>
       </w:r>
     </w:p>
+    <w:p>
+      <w:pPr>
+        <w:sectPr>
+          <w:pgSz w:w="16838" w:h="11906" w:orient="landscape"/>
+          <w:pgMar w:top="576" w:right="504" w:bottom="576" w:left="504" w:header="283" w:footer="283" w:gutter="0"/>
+          <w:cols w:space="720"/>
+          <w:docGrid w:linePitch="360"/>
+        </w:sectPr>
+      </w:pPr>
+    </w:p>
+    <w:p>
+      <w:pPr>
+        <w:pStyle w:val="Heading1"/>
+      </w:pPr>
+      <w:r>
+        <w:t>SOC-01 Publish QA Eligibility Consumer Contract</w:t>
+      </w:r>
+    </w:p>
+    <w:p>
+      <w:r>
+        <w:rPr>
+          <w:b/>
+        </w:rPr>
+        <w:t xml:space="preserve">[ACPOS-20260921-BATCH-02-CONSUMER-CONTRACT-CLOSURE-V1] </w:t>
+      </w:r>
+      <w:r>
+        <w:t>本節只補齊既有 Current source 已可證明的設計契約。既有 Control / Action / Gate / Permission / Owner / Operation / Route 優先；SOURCE_NOT_DEFINED、NO_PUBLIC_API_ID_IN_CURRENT_AUTHORITY、SPEC_EXACT_RUNTIME_BLOCKED 不得由 Word 自行發明或升格為 Runtime 完成。</w:t>
+      </w:r>
+    </w:p>
+    <w:p>
+      <w:r>
+        <w:t>Existing publish authority remains unchanged: SOC-01-BTN-PUBLISH → SOC-01-ACT-PUBLISH-REQUEST → SOC-01-GATE-PUBLISH → SOC-01-PERM-PUBLISH → requestSocialTargetPublish → POST /v1/social/targets/{targetId}/publish → PublishingService. This batch adds the missing governed QA eligibility bindings to that SAME publish gate; it does not create a second publish API.</w:t>
+      </w:r>
+    </w:p>
+    <w:tbl>
+      <w:tblPr>
+        <w:tblStyle w:val="TableGrid"/>
+        <w:tblW w:type="auto" w:w="0"/>
+        <w:tblLook w:firstColumn="1" w:firstRow="1" w:lastColumn="0" w:lastRow="0" w:noHBand="0" w:noVBand="1" w:val="04A0"/>
+      </w:tblPr>
+      <w:tblGrid>
+        <w:gridCol w:w="5449"/>
+        <w:gridCol w:w="5449"/>
+      </w:tblGrid>
+      <w:tr>
+        <w:trPr>
+          <w:tblHeader w:val="true"/>
+        </w:trPr>
+        <w:tc>
+          <w:tcPr>
+            <w:tcW w:type="dxa" w:w="5449"/>
+            <w:shd w:fill="EDE9FE"/>
+          </w:tcPr>
+          <w:p>
+            <w:r>
+              <w:rPr>
+                <w:sz w:val="11"/>
+              </w:rPr>
+              <w:t>QA eligibility binding</w:t>
+            </w:r>
+          </w:p>
+        </w:tc>
+        <w:tc>
+          <w:tcPr>
+            <w:tcW w:type="dxa" w:w="5449"/>
+            <w:shd w:fill="EDE9FE"/>
+          </w:tcPr>
+          <w:p>
+            <w:r>
+              <w:rPr>
+                <w:sz w:val="11"/>
+              </w:rPr>
+              <w:t>Required contract</w:t>
+            </w:r>
+          </w:p>
+        </w:tc>
+      </w:tr>
+      <w:tr>
+        <w:tc>
+          <w:tcPr>
+            <w:tcW w:type="dxa" w:w="5449"/>
+          </w:tcPr>
+          <w:p>
+            <w:r>
+              <w:rPr>
+                <w:sz w:val="11"/>
+              </w:rPr>
+              <w:t>exact_content_ref</w:t>
+            </w:r>
+          </w:p>
+        </w:tc>
+        <w:tc>
+          <w:tcPr>
+            <w:tcW w:type="dxa" w:w="5449"/>
+          </w:tcPr>
+          <w:p>
+            <w:r>
+              <w:rPr>
+                <w:sz w:val="11"/>
+              </w:rPr>
+              <w:t>Exact reviewed content/release candidate ref; alias/latest-only forbidden.</w:t>
+            </w:r>
+          </w:p>
+        </w:tc>
+      </w:tr>
+      <w:tr>
+        <w:tc>
+          <w:tcPr>
+            <w:tcW w:type="dxa" w:w="5449"/>
+          </w:tcPr>
+          <w:p>
+            <w:r>
+              <w:rPr>
+                <w:sz w:val="11"/>
+              </w:rPr>
+              <w:t>output_version_ref</w:t>
+            </w:r>
+          </w:p>
+        </w:tc>
+        <w:tc>
+          <w:tcPr>
+            <w:tcW w:type="dxa" w:w="5449"/>
+          </w:tcPr>
+          <w:p>
+            <w:r>
+              <w:rPr>
+                <w:sz w:val="11"/>
+              </w:rPr>
+              <w:t>Exact reviewed content/output version.</w:t>
+            </w:r>
+          </w:p>
+        </w:tc>
+      </w:tr>
+      <w:tr>
+        <w:tc>
+          <w:tcPr>
+            <w:tcW w:type="dxa" w:w="5449"/>
+          </w:tcPr>
+          <w:p>
+            <w:r>
+              <w:rPr>
+                <w:sz w:val="11"/>
+              </w:rPr>
+              <w:t>artifact_checksum</w:t>
+            </w:r>
+          </w:p>
+        </w:tc>
+        <w:tc>
+          <w:tcPr>
+            <w:tcW w:type="dxa" w:w="5449"/>
+          </w:tcPr>
+          <w:p>
+            <w:r>
+              <w:rPr>
+                <w:sz w:val="11"/>
+              </w:rPr>
+              <w:t>Must match the QA-reviewed artifact/content manifest.</w:t>
+            </w:r>
+          </w:p>
+        </w:tc>
+      </w:tr>
+      <w:tr>
+        <w:tc>
+          <w:tcPr>
+            <w:tcW w:type="dxa" w:w="5449"/>
+          </w:tcPr>
+          <w:p>
+            <w:r>
+              <w:rPr>
+                <w:sz w:val="11"/>
+              </w:rPr>
+              <w:t>criteria_profile_uid</w:t>
+            </w:r>
+          </w:p>
+        </w:tc>
+        <w:tc>
+          <w:tcPr>
+            <w:tcW w:type="dxa" w:w="5449"/>
+          </w:tcPr>
+          <w:p>
+            <w:r>
+              <w:rPr>
+                <w:sz w:val="11"/>
+              </w:rPr>
+              <w:t>Applicable governed QA profile.</w:t>
+            </w:r>
+          </w:p>
+        </w:tc>
+      </w:tr>
+      <w:tr>
+        <w:tc>
+          <w:tcPr>
+            <w:tcW w:type="dxa" w:w="5449"/>
+          </w:tcPr>
+          <w:p>
+            <w:r>
+              <w:rPr>
+                <w:sz w:val="11"/>
+              </w:rPr>
+              <w:t>criteria_version_id</w:t>
+            </w:r>
+          </w:p>
+        </w:tc>
+        <w:tc>
+          <w:tcPr>
+            <w:tcW w:type="dxa" w:w="5449"/>
+          </w:tcPr>
+          <w:p>
+            <w:r>
+              <w:rPr>
+                <w:sz w:val="11"/>
+              </w:rPr>
+              <w:t>Exact APPROVED criteria version.</w:t>
+            </w:r>
+          </w:p>
+        </w:tc>
+      </w:tr>
+      <w:tr>
+        <w:tc>
+          <w:tcPr>
+            <w:tcW w:type="dxa" w:w="5449"/>
+          </w:tcPr>
+          <w:p>
+            <w:r>
+              <w:rPr>
+                <w:sz w:val="11"/>
+              </w:rPr>
+              <w:t>quality_gate_policy_version</w:t>
+            </w:r>
+          </w:p>
+        </w:tc>
+        <w:tc>
+          <w:tcPr>
+            <w:tcW w:type="dxa" w:w="5449"/>
+          </w:tcPr>
+          <w:p>
+            <w:r>
+              <w:rPr>
+                <w:sz w:val="11"/>
+              </w:rPr>
+              <w:t>Exact gate policy version paired with the scorecard.</w:t>
+            </w:r>
+          </w:p>
+        </w:tc>
+      </w:tr>
+      <w:tr>
+        <w:tc>
+          <w:tcPr>
+            <w:tcW w:type="dxa" w:w="5449"/>
+          </w:tcPr>
+          <w:p>
+            <w:r>
+              <w:rPr>
+                <w:sz w:val="11"/>
+              </w:rPr>
+              <w:t>scorecard_id</w:t>
+            </w:r>
+          </w:p>
+        </w:tc>
+        <w:tc>
+          <w:tcPr>
+            <w:tcW w:type="dxa" w:w="5449"/>
+          </w:tcPr>
+          <w:p>
+            <w:r>
+              <w:rPr>
+                <w:sz w:val="11"/>
+              </w:rPr>
+              <w:t>Fresh scorecard for the exact version.</w:t>
+            </w:r>
+          </w:p>
+        </w:tc>
+      </w:tr>
+      <w:tr>
+        <w:tc>
+          <w:tcPr>
+            <w:tcW w:type="dxa" w:w="5449"/>
+          </w:tcPr>
+          <w:p>
+            <w:r>
+              <w:rPr>
+                <w:sz w:val="11"/>
+              </w:rPr>
+              <w:t>qa_gate_status</w:t>
+            </w:r>
+          </w:p>
+        </w:tc>
+        <w:tc>
+          <w:tcPr>
+            <w:tcW w:type="dxa" w:w="5449"/>
+          </w:tcPr>
+          <w:p>
+            <w:r>
+              <w:rPr>
+                <w:sz w:val="11"/>
+              </w:rPr>
+              <w:t>Must equal PASS for governed publish eligibility.</w:t>
+            </w:r>
+          </w:p>
+        </w:tc>
+      </w:tr>
+      <w:tr>
+        <w:tc>
+          <w:tcPr>
+            <w:tcW w:type="dxa" w:w="5449"/>
+          </w:tcPr>
+          <w:p>
+            <w:r>
+              <w:rPr>
+                <w:sz w:val="11"/>
+              </w:rPr>
+              <w:t>required_checks</w:t>
+            </w:r>
+          </w:p>
+        </w:tc>
+        <w:tc>
+          <w:tcPr>
+            <w:tcW w:type="dxa" w:w="5449"/>
+          </w:tcPr>
+          <w:p>
+            <w:r>
+              <w:rPr>
+                <w:sz w:val="11"/>
+              </w:rPr>
+              <w:t>All applicable hard checks PASS, including Rights/Policy/Provenance/Checksum where required.</w:t>
+            </w:r>
+          </w:p>
+        </w:tc>
+      </w:tr>
+      <w:tr>
+        <w:tc>
+          <w:tcPr>
+            <w:tcW w:type="dxa" w:w="5449"/>
+          </w:tcPr>
+          <w:p>
+            <w:r>
+              <w:rPr>
+                <w:sz w:val="11"/>
+              </w:rPr>
+              <w:t>open_blocking_findings</w:t>
+            </w:r>
+          </w:p>
+        </w:tc>
+        <w:tc>
+          <w:tcPr>
+            <w:tcW w:type="dxa" w:w="5449"/>
+          </w:tcPr>
+          <w:p>
+            <w:r>
+              <w:rPr>
+                <w:sz w:val="11"/>
+              </w:rPr>
+              <w:t>Must equal 0.</w:t>
+            </w:r>
+          </w:p>
+        </w:tc>
+      </w:tr>
+      <w:tr>
+        <w:tc>
+          <w:tcPr>
+            <w:tcW w:type="dxa" w:w="5449"/>
+          </w:tcPr>
+          <w:p>
+            <w:r>
+              <w:rPr>
+                <w:sz w:val="11"/>
+              </w:rPr>
+              <w:t>evidence_refs</w:t>
+            </w:r>
+          </w:p>
+        </w:tc>
+        <w:tc>
+          <w:tcPr>
+            <w:tcW w:type="dxa" w:w="5449"/>
+          </w:tcPr>
+          <w:p>
+            <w:r>
+              <w:rPr>
+                <w:sz w:val="11"/>
+              </w:rPr>
+              <w:t>Required-check / review / recheck / manual-case evidence lineage.</w:t>
+            </w:r>
+          </w:p>
+        </w:tc>
+      </w:tr>
+    </w:tbl>
+    <w:tbl>
+      <w:tblPr>
+        <w:tblStyle w:val="TableGrid"/>
+        <w:tblW w:type="auto" w:w="0"/>
+        <w:tblLook w:firstColumn="1" w:firstRow="1" w:lastColumn="0" w:lastRow="0" w:noHBand="0" w:noVBand="1" w:val="04A0"/>
+      </w:tblPr>
+      <w:tblGrid>
+        <w:gridCol w:w="5449"/>
+        <w:gridCol w:w="5449"/>
+      </w:tblGrid>
+      <w:tr>
+        <w:trPr>
+          <w:tblHeader w:val="true"/>
+        </w:trPr>
+        <w:tc>
+          <w:tcPr>
+            <w:tcW w:type="dxa" w:w="5449"/>
+            <w:shd w:fill="EDE9FE"/>
+          </w:tcPr>
+          <w:p>
+            <w:r>
+              <w:rPr>
+                <w:sz w:val="11"/>
+              </w:rPr>
+              <w:t>Gate condition</w:t>
+            </w:r>
+          </w:p>
+        </w:tc>
+        <w:tc>
+          <w:tcPr>
+            <w:tcW w:type="dxa" w:w="5449"/>
+            <w:shd w:fill="EDE9FE"/>
+          </w:tcPr>
+          <w:p>
+            <w:r>
+              <w:rPr>
+                <w:sz w:val="11"/>
+              </w:rPr>
+              <w:t>Required behavior</w:t>
+            </w:r>
+          </w:p>
+        </w:tc>
+      </w:tr>
+      <w:tr>
+        <w:tc>
+          <w:tcPr>
+            <w:tcW w:type="dxa" w:w="5449"/>
+          </w:tcPr>
+          <w:p>
+            <w:r>
+              <w:rPr>
+                <w:sz w:val="11"/>
+              </w:rPr>
+              <w:t>Exact target/content/account/policy valid</w:t>
+            </w:r>
+          </w:p>
+        </w:tc>
+        <w:tc>
+          <w:tcPr>
+            <w:tcW w:type="dxa" w:w="5449"/>
+          </w:tcPr>
+          <w:p>
+            <w:r>
+              <w:rPr>
+                <w:sz w:val="11"/>
+              </w:rPr>
+              <w:t>Continue to QA eligibility validation.</w:t>
+            </w:r>
+          </w:p>
+        </w:tc>
+      </w:tr>
+      <w:tr>
+        <w:tc>
+          <w:tcPr>
+            <w:tcW w:type="dxa" w:w="5449"/>
+          </w:tcPr>
+          <w:p>
+            <w:r>
+              <w:rPr>
+                <w:sz w:val="11"/>
+              </w:rPr>
+              <w:t>Missing exact version/checksum/criteria/scorecard/evidence</w:t>
+            </w:r>
+          </w:p>
+        </w:tc>
+        <w:tc>
+          <w:tcPr>
+            <w:tcW w:type="dxa" w:w="5449"/>
+          </w:tcPr>
+          <w:p>
+            <w:r>
+              <w:rPr>
+                <w:sz w:val="11"/>
+              </w:rPr>
+              <w:t>BLOCK before requestSocialTargetPublish.</w:t>
+            </w:r>
+          </w:p>
+        </w:tc>
+      </w:tr>
+      <w:tr>
+        <w:tc>
+          <w:tcPr>
+            <w:tcW w:type="dxa" w:w="5449"/>
+          </w:tcPr>
+          <w:p>
+            <w:r>
+              <w:rPr>
+                <w:sz w:val="11"/>
+              </w:rPr>
+              <w:t>Artifact/content changed after QA</w:t>
+            </w:r>
+          </w:p>
+        </w:tc>
+        <w:tc>
+          <w:tcPr>
+            <w:tcW w:type="dxa" w:w="5449"/>
+          </w:tcPr>
+          <w:p>
+            <w:r>
+              <w:rPr>
+                <w:sz w:val="11"/>
+              </w:rPr>
+              <w:t>Previous scorecard becomes stale; BLOCK until fresh recheck.</w:t>
+            </w:r>
+          </w:p>
+        </w:tc>
+      </w:tr>
+      <w:tr>
+        <w:tc>
+          <w:tcPr>
+            <w:tcW w:type="dxa" w:w="5449"/>
+          </w:tcPr>
+          <w:p>
+            <w:r>
+              <w:rPr>
+                <w:sz w:val="11"/>
+              </w:rPr>
+              <w:t>qa_gate_status != PASS</w:t>
+            </w:r>
+          </w:p>
+        </w:tc>
+        <w:tc>
+          <w:tcPr>
+            <w:tcW w:type="dxa" w:w="5449"/>
+          </w:tcPr>
+          <w:p>
+            <w:r>
+              <w:rPr>
+                <w:sz w:val="11"/>
+              </w:rPr>
+              <w:t>BLOCK.</w:t>
+            </w:r>
+          </w:p>
+        </w:tc>
+      </w:tr>
+      <w:tr>
+        <w:tc>
+          <w:tcPr>
+            <w:tcW w:type="dxa" w:w="5449"/>
+          </w:tcPr>
+          <w:p>
+            <w:r>
+              <w:rPr>
+                <w:sz w:val="11"/>
+              </w:rPr>
+              <w:t>required hard check FAIL or open_blocking_findings &gt; 0</w:t>
+            </w:r>
+          </w:p>
+        </w:tc>
+        <w:tc>
+          <w:tcPr>
+            <w:tcW w:type="dxa" w:w="5449"/>
+          </w:tcPr>
+          <w:p>
+            <w:r>
+              <w:rPr>
+                <w:sz w:val="11"/>
+              </w:rPr>
+              <w:t>BLOCK regardless of aggregate score or business approval.</w:t>
+            </w:r>
+          </w:p>
+        </w:tc>
+      </w:tr>
+      <w:tr>
+        <w:tc>
+          <w:tcPr>
+            <w:tcW w:type="dxa" w:w="5449"/>
+          </w:tcPr>
+          <w:p>
+            <w:r>
+              <w:rPr>
+                <w:sz w:val="11"/>
+              </w:rPr>
+              <w:t>Eligibility PASS</w:t>
+            </w:r>
+          </w:p>
+        </w:tc>
+        <w:tc>
+          <w:tcPr>
+            <w:tcW w:type="dxa" w:w="5449"/>
+          </w:tcPr>
+          <w:p>
+            <w:r>
+              <w:rPr>
+                <w:sz w:val="11"/>
+              </w:rPr>
+              <w:t>May invoke existing requestSocialTargetPublish only; local request acceptance becomes PENDING_EXTERNAL, not POSTED.</w:t>
+            </w:r>
+          </w:p>
+        </w:tc>
+      </w:tr>
+      <w:tr>
+        <w:tc>
+          <w:tcPr>
+            <w:tcW w:type="dxa" w:w="5449"/>
+          </w:tcPr>
+          <w:p>
+            <w:r>
+              <w:rPr>
+                <w:sz w:val="11"/>
+              </w:rPr>
+              <w:t>External result</w:t>
+            </w:r>
+          </w:p>
+        </w:tc>
+        <w:tc>
+          <w:tcPr>
+            <w:tcW w:type="dxa" w:w="5449"/>
+          </w:tcPr>
+          <w:p>
+            <w:r>
+              <w:rPr>
+                <w:sz w:val="11"/>
+              </w:rPr>
+              <w:t>Only real adapter callback/result can transition external publish truth to POSTED/failed/other recorded state.</w:t>
+            </w:r>
+          </w:p>
+        </w:tc>
+      </w:tr>
+    </w:tbl>
     <w:sectPr>
-      <w:pgSz w:w="16838" w:h="11906" w:orient="landscape"/>
+      <w:pgSz w:w="11906" w:h="16838" w:orient="landscape"/>
       <w:pgMar w:top="576" w:right="504" w:bottom="576" w:left="504" w:header="283" w:footer="283" w:gutter="0"/>
       <w:cols w:space="720"/>
       <w:docGrid w:linePitch="360"/>

</xml_diff>

<commit_message>
docs(acpos): close system07 social contract gaps
</commit_message>
<xml_diff>
--- a/ACPOS_SOC-01_社群發布_Mother_Basic_Design_OPTIMIZED.docx
+++ b/ACPOS_SOC-01_社群發布_Mother_Basic_Design_OPTIMIZED.docx
@@ -13181,10 +13181,7 @@
           </w:tcPr>
           <w:p>
             <w:r>
-              <w:rPr>
-                <w:sz w:val="10"/>
-              </w:rPr>
-              <w:t>—</w:t>
+              <w:t>BindSocialAccountRequest</w:t>
             </w:r>
           </w:p>
         </w:tc>
@@ -13233,10 +13230,7 @@
           </w:tcPr>
           <w:p>
             <w:r>
-              <w:rPr>
-                <w:sz w:val="10"/>
-              </w:rPr>
-              <w:t>—</w:t>
+              <w:t>System 07 / SocialAccountBinding + Audit</w:t>
             </w:r>
           </w:p>
         </w:tc>
@@ -13352,10 +13346,7 @@
           </w:tcPr>
           <w:p>
             <w:r>
-              <w:rPr>
-                <w:sz w:val="10"/>
-              </w:rPr>
-              <w:t>—</w:t>
+              <w:t>UnbindSocialAccountRequest</w:t>
             </w:r>
           </w:p>
         </w:tc>
@@ -13404,10 +13395,7 @@
           </w:tcPr>
           <w:p>
             <w:r>
-              <w:rPr>
-                <w:sz w:val="10"/>
-              </w:rPr>
-              <w:t>—</w:t>
+              <w:t>System 07 / SocialAccountBinding State + Audit</w:t>
             </w:r>
           </w:p>
         </w:tc>
@@ -13523,10 +13511,7 @@
           </w:tcPr>
           <w:p>
             <w:r>
-              <w:rPr>
-                <w:sz w:val="10"/>
-              </w:rPr>
-              <w:t>—</w:t>
+              <w:t>DecideSocialContentCandidateRequest</w:t>
             </w:r>
           </w:p>
         </w:tc>
@@ -13694,10 +13679,7 @@
           </w:tcPr>
           <w:p>
             <w:r>
-              <w:rPr>
-                <w:sz w:val="10"/>
-              </w:rPr>
-              <w:t>—</w:t>
+              <w:t>SaveSocialContentDraftRequest</w:t>
             </w:r>
           </w:p>
         </w:tc>
@@ -13746,10 +13728,7 @@
           </w:tcPr>
           <w:p>
             <w:r>
-              <w:rPr>
-                <w:sz w:val="10"/>
-              </w:rPr>
-              <w:t>—</w:t>
+              <w:t>Existing Draft/Candidate Owner / Social Content Draft + Audit</w:t>
             </w:r>
           </w:p>
         </w:tc>
@@ -13865,10 +13844,7 @@
           </w:tcPr>
           <w:p>
             <w:r>
-              <w:rPr>
-                <w:sz w:val="10"/>
-              </w:rPr>
-              <w:t>—</w:t>
+              <w:t>RevealSocialCredentialRequest</w:t>
             </w:r>
           </w:p>
         </w:tc>
@@ -13917,10 +13893,7 @@
           </w:tcPr>
           <w:p>
             <w:r>
-              <w:rPr>
-                <w:sz w:val="10"/>
-              </w:rPr>
-              <w:t>—</w:t>
+              <w:t>Secret/Vault Owner + Credential Reveal Audit</w:t>
             </w:r>
           </w:p>
         </w:tc>
@@ -14207,10 +14180,7 @@
           </w:tcPr>
           <w:p>
             <w:r>
-              <w:rPr>
-                <w:sz w:val="10"/>
-              </w:rPr>
-              <w:t>—</w:t>
+              <w:t>SetKillSwitchRequest</w:t>
             </w:r>
           </w:p>
         </w:tc>
@@ -14259,10 +14229,7 @@
           </w:tcPr>
           <w:p>
             <w:r>
-              <w:rPr>
-                <w:sz w:val="10"/>
-              </w:rPr>
-              <w:t>—</w:t>
+              <w:t>Existing Operations Governance / Kill Switch State + Audit</w:t>
             </w:r>
           </w:p>
         </w:tc>
@@ -14378,10 +14345,7 @@
           </w:tcPr>
           <w:p>
             <w:r>
-              <w:rPr>
-                <w:sz w:val="10"/>
-              </w:rPr>
-              <w:t>—</w:t>
+              <w:t>CompleteSocialManualActionRequest</w:t>
             </w:r>
           </w:p>
         </w:tc>
@@ -14430,10 +14394,7 @@
           </w:tcPr>
           <w:p>
             <w:r>
-              <w:rPr>
-                <w:sz w:val="10"/>
-              </w:rPr>
-              <w:t>—</w:t>
+              <w:t>System 07 / Social Manual Action + Audit</w:t>
             </w:r>
           </w:p>
         </w:tc>
@@ -14549,10 +14510,7 @@
           </w:tcPr>
           <w:p>
             <w:r>
-              <w:rPr>
-                <w:sz w:val="10"/>
-              </w:rPr>
-              <w:t>—</w:t>
+              <w:t>ConfigureGovernedResourceRequest</w:t>
             </w:r>
           </w:p>
         </w:tc>
@@ -14601,10 +14559,7 @@
           </w:tcPr>
           <w:p>
             <w:r>
-              <w:rPr>
-                <w:sz w:val="10"/>
-              </w:rPr>
-              <w:t>—</w:t>
+              <w:t>Resolved Governed Resource Canonical Owner + Governance Audit</w:t>
             </w:r>
           </w:p>
         </w:tc>
@@ -14720,10 +14675,7 @@
           </w:tcPr>
           <w:p>
             <w:r>
-              <w:rPr>
-                <w:sz w:val="10"/>
-              </w:rPr>
-              <w:t>—</w:t>
+              <w:t>ConfigureSocialTargetPolicyRequest</w:t>
             </w:r>
           </w:p>
         </w:tc>
@@ -14772,10 +14724,7 @@
           </w:tcPr>
           <w:p>
             <w:r>
-              <w:rPr>
-                <w:sz w:val="10"/>
-              </w:rPr>
-              <w:t>—</w:t>
+              <w:t>System 07 / Social Target Posting Policy + Audit</w:t>
             </w:r>
           </w:p>
         </w:tc>
@@ -14891,10 +14840,7 @@
           </w:tcPr>
           <w:p>
             <w:r>
-              <w:rPr>
-                <w:sz w:val="10"/>
-              </w:rPr>
-              <w:t>—</w:t>
+              <w:t>SocialTargetPublishRequest</w:t>
             </w:r>
           </w:p>
         </w:tc>
@@ -14943,10 +14889,7 @@
           </w:tcPr>
           <w:p>
             <w:r>
-              <w:rPr>
-                <w:sz w:val="10"/>
-              </w:rPr>
-              <w:t>—</w:t>
+              <w:t>System 07 / PublishRequest + Target Publish State + Audit</w:t>
             </w:r>
           </w:p>
         </w:tc>
@@ -15062,10 +15005,7 @@
           </w:tcPr>
           <w:p>
             <w:r>
-              <w:rPr>
-                <w:sz w:val="10"/>
-              </w:rPr>
-              <w:t>—</w:t>
+              <w:t>RefreshSocialProjectionRequest</w:t>
             </w:r>
           </w:p>
         </w:tc>
@@ -15114,10 +15054,7 @@
           </w:tcPr>
           <w:p>
             <w:r>
-              <w:rPr>
-                <w:sz w:val="10"/>
-              </w:rPr>
-              <w:t>—</w:t>
+              <w:t>System 07 / Social Projection + Projection Audit</w:t>
             </w:r>
           </w:p>
         </w:tc>
@@ -15233,10 +15170,7 @@
           </w:tcPr>
           <w:p>
             <w:r>
-              <w:rPr>
-                <w:sz w:val="10"/>
-              </w:rPr>
-              <w:t>—</w:t>
+              <w:t>CreateSocialTargetDiscoveryRequest</w:t>
             </w:r>
           </w:p>
         </w:tc>
@@ -15285,10 +15219,7 @@
           </w:tcPr>
           <w:p>
             <w:r>
-              <w:rPr>
-                <w:sz w:val="10"/>
-              </w:rPr>
-              <w:t>—</w:t>
+              <w:t>System 07 / SocialTargetDiscoveryJob + Discovery Evidence</w:t>
             </w:r>
           </w:p>
         </w:tc>
@@ -15404,10 +15335,7 @@
           </w:tcPr>
           <w:p>
             <w:r>
-              <w:rPr>
-                <w:sz w:val="10"/>
-              </w:rPr>
-              <w:t>—</w:t>
+              <w:t>SocialTargetJoinRequest</w:t>
             </w:r>
           </w:p>
         </w:tc>
@@ -15456,10 +15384,7 @@
           </w:tcPr>
           <w:p>
             <w:r>
-              <w:rPr>
-                <w:sz w:val="10"/>
-              </w:rPr>
-              <w:t>—</w:t>
+              <w:t>System 07 / Social Target Join Request + Audit</w:t>
             </w:r>
           </w:p>
         </w:tc>
@@ -23441,10 +23366,7 @@
           </w:tcPr>
           <w:p>
             <w:r>
-              <w:rPr>
-                <w:sz w:val="10"/>
-              </w:rPr>
-              <w:t>—</w:t>
+              <w:t>SearchSocialProjectionRequest</w:t>
             </w:r>
           </w:p>
         </w:tc>
@@ -23493,10 +23415,7 @@
           </w:tcPr>
           <w:p>
             <w:r>
-              <w:rPr>
-                <w:sz w:val="10"/>
-              </w:rPr>
-              <w:t>—</w:t>
+              <w:t>System 07 / Search Projection Result + Search Audit</w:t>
             </w:r>
           </w:p>
         </w:tc>
@@ -23612,10 +23531,7 @@
           </w:tcPr>
           <w:p>
             <w:r>
-              <w:rPr>
-                <w:sz w:val="10"/>
-              </w:rPr>
-              <w:t>—</w:t>
+              <w:t>SearchSocialProjectionRequest</w:t>
             </w:r>
           </w:p>
         </w:tc>
@@ -23664,10 +23580,7 @@
           </w:tcPr>
           <w:p>
             <w:r>
-              <w:rPr>
-                <w:sz w:val="10"/>
-              </w:rPr>
-              <w:t>—</w:t>
+              <w:t>System 07 / Search Projection Result + Search Audit</w:t>
             </w:r>
           </w:p>
         </w:tc>
@@ -25180,9 +25093,1104 @@
         </w:tc>
       </w:tr>
     </w:tbl>
+    <w:p>
+      <w:pPr>
+        <w:sectPr>
+          <w:pgSz w:w="11906" w:h="16838" w:orient="landscape"/>
+          <w:pgMar w:top="576" w:right="504" w:bottom="576" w:left="504" w:header="283" w:footer="283" w:gutter="0"/>
+          <w:cols w:space="720"/>
+          <w:docGrid w:linePitch="360"/>
+        </w:sectPr>
+      </w:pPr>
+    </w:p>
+    <w:p>
+      <w:pPr>
+        <w:pStyle w:val="Heading1"/>
+      </w:pPr>
+      <w:r>
+        <w:t>Batch 47 · SOC-01 Social Contract Binding Ledger</w:t>
+      </w:r>
+    </w:p>
+    <w:p>
+      <w:r>
+        <w:t>[ACPOS-20260922-BATCH-47-SYSTEM07-SOCIAL-CONTRACT-REMEDIATION-V1] Social effectful contracts preserve external-provider truth, secret isolation, candidate governance and derived-projection boundaries. Credential reveal never persists plaintext secret; local publish request acceptance never equals external publish success.</w:t>
+      </w:r>
+    </w:p>
+    <w:tbl>
+      <w:tblPr>
+        <w:tblStyle w:val="TableGrid"/>
+        <w:tblW w:type="auto" w:w="0"/>
+        <w:tblLook w:firstColumn="1" w:firstRow="1" w:lastColumn="0" w:lastRow="0" w:noHBand="0" w:noVBand="1" w:val="04A0"/>
+      </w:tblPr>
+      <w:tblGrid>
+        <w:gridCol w:w="4008"/>
+        <w:gridCol w:w="4008"/>
+        <w:gridCol w:w="4008"/>
+        <w:gridCol w:w="4008"/>
+      </w:tblGrid>
+      <w:tr>
+        <w:trPr>
+          <w:tblHeader w:val="true"/>
+        </w:trPr>
+        <w:tc>
+          <w:tcPr>
+            <w:tcW w:type="dxa" w:w="4008"/>
+          </w:tcPr>
+          <w:p>
+            <w:pPr>
+              <w:spacing w:after="0"/>
+            </w:pPr>
+            <w:r>
+              <w:rPr>
+                <w:sz w:val="7"/>
+              </w:rPr>
+              <w:t>Control UID</w:t>
+            </w:r>
+          </w:p>
+        </w:tc>
+        <w:tc>
+          <w:tcPr>
+            <w:tcW w:type="dxa" w:w="4008"/>
+          </w:tcPr>
+          <w:p>
+            <w:pPr>
+              <w:spacing w:after="0"/>
+            </w:pPr>
+            <w:r>
+              <w:rPr>
+                <w:sz w:val="7"/>
+              </w:rPr>
+              <w:t>Operation</w:t>
+            </w:r>
+          </w:p>
+        </w:tc>
+        <w:tc>
+          <w:tcPr>
+            <w:tcW w:type="dxa" w:w="4008"/>
+          </w:tcPr>
+          <w:p>
+            <w:pPr>
+              <w:spacing w:after="0"/>
+            </w:pPr>
+            <w:r>
+              <w:rPr>
+                <w:sz w:val="7"/>
+              </w:rPr>
+              <w:t>Payload / Schema</w:t>
+            </w:r>
+          </w:p>
+        </w:tc>
+        <w:tc>
+          <w:tcPr>
+            <w:tcW w:type="dxa" w:w="4008"/>
+          </w:tcPr>
+          <w:p>
+            <w:pPr>
+              <w:spacing w:after="0"/>
+            </w:pPr>
+            <w:r>
+              <w:rPr>
+                <w:sz w:val="7"/>
+              </w:rPr>
+              <w:t>Persistence Owner</w:t>
+            </w:r>
+          </w:p>
+        </w:tc>
+      </w:tr>
+      <w:tr>
+        <w:tc>
+          <w:tcPr>
+            <w:tcW w:type="dxa" w:w="4008"/>
+          </w:tcPr>
+          <w:p>
+            <w:pPr>
+              <w:spacing w:after="0"/>
+            </w:pPr>
+            <w:r>
+              <w:rPr>
+                <w:sz w:val="7"/>
+              </w:rPr>
+              <w:t>SOC-01-BTN-ACCOUNT-BIND</w:t>
+            </w:r>
+          </w:p>
+        </w:tc>
+        <w:tc>
+          <w:tcPr>
+            <w:tcW w:type="dxa" w:w="4008"/>
+          </w:tcPr>
+          <w:p>
+            <w:pPr>
+              <w:spacing w:after="0"/>
+            </w:pPr>
+            <w:r>
+              <w:rPr>
+                <w:sz w:val="7"/>
+              </w:rPr>
+              <w:t>bindSocialAccount</w:t>
+            </w:r>
+          </w:p>
+        </w:tc>
+        <w:tc>
+          <w:tcPr>
+            <w:tcW w:type="dxa" w:w="4008"/>
+          </w:tcPr>
+          <w:p>
+            <w:pPr>
+              <w:spacing w:after="0"/>
+            </w:pPr>
+            <w:r>
+              <w:rPr>
+                <w:sz w:val="7"/>
+              </w:rPr>
+              <w:t>BindSocialAccountRequest</w:t>
+            </w:r>
+          </w:p>
+        </w:tc>
+        <w:tc>
+          <w:tcPr>
+            <w:tcW w:type="dxa" w:w="4008"/>
+          </w:tcPr>
+          <w:p>
+            <w:pPr>
+              <w:spacing w:after="0"/>
+            </w:pPr>
+            <w:r>
+              <w:rPr>
+                <w:sz w:val="7"/>
+              </w:rPr>
+              <w:t>System 07 / SocialAccountBinding + Audit</w:t>
+            </w:r>
+          </w:p>
+        </w:tc>
+      </w:tr>
+      <w:tr>
+        <w:tc>
+          <w:tcPr>
+            <w:tcW w:type="dxa" w:w="4008"/>
+          </w:tcPr>
+          <w:p>
+            <w:pPr>
+              <w:spacing w:after="0"/>
+            </w:pPr>
+            <w:r>
+              <w:rPr>
+                <w:sz w:val="7"/>
+              </w:rPr>
+              <w:t>SOC-01-BTN-ACCOUNT-UNBIND</w:t>
+            </w:r>
+          </w:p>
+        </w:tc>
+        <w:tc>
+          <w:tcPr>
+            <w:tcW w:type="dxa" w:w="4008"/>
+          </w:tcPr>
+          <w:p>
+            <w:pPr>
+              <w:spacing w:after="0"/>
+            </w:pPr>
+            <w:r>
+              <w:rPr>
+                <w:sz w:val="7"/>
+              </w:rPr>
+              <w:t>unbindSocialAccount</w:t>
+            </w:r>
+          </w:p>
+        </w:tc>
+        <w:tc>
+          <w:tcPr>
+            <w:tcW w:type="dxa" w:w="4008"/>
+          </w:tcPr>
+          <w:p>
+            <w:pPr>
+              <w:spacing w:after="0"/>
+            </w:pPr>
+            <w:r>
+              <w:rPr>
+                <w:sz w:val="7"/>
+              </w:rPr>
+              <w:t>UnbindSocialAccountRequest</w:t>
+            </w:r>
+          </w:p>
+        </w:tc>
+        <w:tc>
+          <w:tcPr>
+            <w:tcW w:type="dxa" w:w="4008"/>
+          </w:tcPr>
+          <w:p>
+            <w:pPr>
+              <w:spacing w:after="0"/>
+            </w:pPr>
+            <w:r>
+              <w:rPr>
+                <w:sz w:val="7"/>
+              </w:rPr>
+              <w:t>System 07 / SocialAccountBinding State + Audit</w:t>
+            </w:r>
+          </w:p>
+        </w:tc>
+      </w:tr>
+      <w:tr>
+        <w:tc>
+          <w:tcPr>
+            <w:tcW w:type="dxa" w:w="4008"/>
+          </w:tcPr>
+          <w:p>
+            <w:pPr>
+              <w:spacing w:after="0"/>
+            </w:pPr>
+            <w:r>
+              <w:rPr>
+                <w:sz w:val="7"/>
+              </w:rPr>
+              <w:t>SOC-01-BTN-CANDIDATE-DECIDE</w:t>
+            </w:r>
+          </w:p>
+        </w:tc>
+        <w:tc>
+          <w:tcPr>
+            <w:tcW w:type="dxa" w:w="4008"/>
+          </w:tcPr>
+          <w:p>
+            <w:pPr>
+              <w:spacing w:after="0"/>
+            </w:pPr>
+            <w:r>
+              <w:rPr>
+                <w:sz w:val="7"/>
+              </w:rPr>
+              <w:t>decideCandidate</w:t>
+            </w:r>
+          </w:p>
+        </w:tc>
+        <w:tc>
+          <w:tcPr>
+            <w:tcW w:type="dxa" w:w="4008"/>
+          </w:tcPr>
+          <w:p>
+            <w:pPr>
+              <w:spacing w:after="0"/>
+            </w:pPr>
+            <w:r>
+              <w:rPr>
+                <w:sz w:val="7"/>
+              </w:rPr>
+              <w:t>DecideSocialContentCandidateRequest</w:t>
+            </w:r>
+          </w:p>
+        </w:tc>
+        <w:tc>
+          <w:tcPr>
+            <w:tcW w:type="dxa" w:w="4008"/>
+          </w:tcPr>
+          <w:p>
+            <w:pPr>
+              <w:spacing w:after="0"/>
+            </w:pPr>
+            <w:r>
+              <w:rPr>
+                <w:sz w:val="7"/>
+              </w:rPr>
+              <w:t>UNCHANGED</w:t>
+            </w:r>
+          </w:p>
+        </w:tc>
+      </w:tr>
+      <w:tr>
+        <w:tc>
+          <w:tcPr>
+            <w:tcW w:type="dxa" w:w="4008"/>
+          </w:tcPr>
+          <w:p>
+            <w:pPr>
+              <w:spacing w:after="0"/>
+            </w:pPr>
+            <w:r>
+              <w:rPr>
+                <w:sz w:val="7"/>
+              </w:rPr>
+              <w:t>SOC-01-BTN-CONTENT-SAVE</w:t>
+            </w:r>
+          </w:p>
+        </w:tc>
+        <w:tc>
+          <w:tcPr>
+            <w:tcW w:type="dxa" w:w="4008"/>
+          </w:tcPr>
+          <w:p>
+            <w:pPr>
+              <w:spacing w:after="0"/>
+            </w:pPr>
+            <w:r>
+              <w:rPr>
+                <w:sz w:val="7"/>
+              </w:rPr>
+              <w:t>saveDraft</w:t>
+            </w:r>
+          </w:p>
+        </w:tc>
+        <w:tc>
+          <w:tcPr>
+            <w:tcW w:type="dxa" w:w="4008"/>
+          </w:tcPr>
+          <w:p>
+            <w:pPr>
+              <w:spacing w:after="0"/>
+            </w:pPr>
+            <w:r>
+              <w:rPr>
+                <w:sz w:val="7"/>
+              </w:rPr>
+              <w:t>SaveSocialContentDraftRequest</w:t>
+            </w:r>
+          </w:p>
+        </w:tc>
+        <w:tc>
+          <w:tcPr>
+            <w:tcW w:type="dxa" w:w="4008"/>
+          </w:tcPr>
+          <w:p>
+            <w:pPr>
+              <w:spacing w:after="0"/>
+            </w:pPr>
+            <w:r>
+              <w:rPr>
+                <w:sz w:val="7"/>
+              </w:rPr>
+              <w:t>Existing Draft/Candidate Owner / Social Content Draft + Audit</w:t>
+            </w:r>
+          </w:p>
+        </w:tc>
+      </w:tr>
+      <w:tr>
+        <w:tc>
+          <w:tcPr>
+            <w:tcW w:type="dxa" w:w="4008"/>
+          </w:tcPr>
+          <w:p>
+            <w:pPr>
+              <w:spacing w:after="0"/>
+            </w:pPr>
+            <w:r>
+              <w:rPr>
+                <w:sz w:val="7"/>
+              </w:rPr>
+              <w:t>SOC-01-BTN-CREDENTIAL-REVEAL</w:t>
+            </w:r>
+          </w:p>
+        </w:tc>
+        <w:tc>
+          <w:tcPr>
+            <w:tcW w:type="dxa" w:w="4008"/>
+          </w:tcPr>
+          <w:p>
+            <w:pPr>
+              <w:spacing w:after="0"/>
+            </w:pPr>
+            <w:r>
+              <w:rPr>
+                <w:sz w:val="7"/>
+              </w:rPr>
+              <w:t>revealSocialCredential</w:t>
+            </w:r>
+          </w:p>
+        </w:tc>
+        <w:tc>
+          <w:tcPr>
+            <w:tcW w:type="dxa" w:w="4008"/>
+          </w:tcPr>
+          <w:p>
+            <w:pPr>
+              <w:spacing w:after="0"/>
+            </w:pPr>
+            <w:r>
+              <w:rPr>
+                <w:sz w:val="7"/>
+              </w:rPr>
+              <w:t>RevealSocialCredentialRequest</w:t>
+            </w:r>
+          </w:p>
+        </w:tc>
+        <w:tc>
+          <w:tcPr>
+            <w:tcW w:type="dxa" w:w="4008"/>
+          </w:tcPr>
+          <w:p>
+            <w:pPr>
+              <w:spacing w:after="0"/>
+            </w:pPr>
+            <w:r>
+              <w:rPr>
+                <w:sz w:val="7"/>
+              </w:rPr>
+              <w:t>Secret/Vault Owner + Credential Reveal Audit</w:t>
+            </w:r>
+          </w:p>
+        </w:tc>
+      </w:tr>
+      <w:tr>
+        <w:tc>
+          <w:tcPr>
+            <w:tcW w:type="dxa" w:w="4008"/>
+          </w:tcPr>
+          <w:p>
+            <w:pPr>
+              <w:spacing w:after="0"/>
+            </w:pPr>
+            <w:r>
+              <w:rPr>
+                <w:sz w:val="7"/>
+              </w:rPr>
+              <w:t>SOC-01-BTN-KILL</w:t>
+            </w:r>
+          </w:p>
+        </w:tc>
+        <w:tc>
+          <w:tcPr>
+            <w:tcW w:type="dxa" w:w="4008"/>
+          </w:tcPr>
+          <w:p>
+            <w:pPr>
+              <w:spacing w:after="0"/>
+            </w:pPr>
+            <w:r>
+              <w:rPr>
+                <w:sz w:val="7"/>
+              </w:rPr>
+              <w:t>setKillSwitch</w:t>
+            </w:r>
+          </w:p>
+        </w:tc>
+        <w:tc>
+          <w:tcPr>
+            <w:tcW w:type="dxa" w:w="4008"/>
+          </w:tcPr>
+          <w:p>
+            <w:pPr>
+              <w:spacing w:after="0"/>
+            </w:pPr>
+            <w:r>
+              <w:rPr>
+                <w:sz w:val="7"/>
+              </w:rPr>
+              <w:t>SetKillSwitchRequest</w:t>
+            </w:r>
+          </w:p>
+        </w:tc>
+        <w:tc>
+          <w:tcPr>
+            <w:tcW w:type="dxa" w:w="4008"/>
+          </w:tcPr>
+          <w:p>
+            <w:pPr>
+              <w:spacing w:after="0"/>
+            </w:pPr>
+            <w:r>
+              <w:rPr>
+                <w:sz w:val="7"/>
+              </w:rPr>
+              <w:t>Existing Operations Governance / Kill Switch State + Audit</w:t>
+            </w:r>
+          </w:p>
+        </w:tc>
+      </w:tr>
+      <w:tr>
+        <w:tc>
+          <w:tcPr>
+            <w:tcW w:type="dxa" w:w="4008"/>
+          </w:tcPr>
+          <w:p>
+            <w:pPr>
+              <w:spacing w:after="0"/>
+            </w:pPr>
+            <w:r>
+              <w:rPr>
+                <w:sz w:val="7"/>
+              </w:rPr>
+              <w:t>SOC-01-BTN-MANUAL-COMPLETE</w:t>
+            </w:r>
+          </w:p>
+        </w:tc>
+        <w:tc>
+          <w:tcPr>
+            <w:tcW w:type="dxa" w:w="4008"/>
+          </w:tcPr>
+          <w:p>
+            <w:pPr>
+              <w:spacing w:after="0"/>
+            </w:pPr>
+            <w:r>
+              <w:rPr>
+                <w:sz w:val="7"/>
+              </w:rPr>
+              <w:t>completeSocialManualAction</w:t>
+            </w:r>
+          </w:p>
+        </w:tc>
+        <w:tc>
+          <w:tcPr>
+            <w:tcW w:type="dxa" w:w="4008"/>
+          </w:tcPr>
+          <w:p>
+            <w:pPr>
+              <w:spacing w:after="0"/>
+            </w:pPr>
+            <w:r>
+              <w:rPr>
+                <w:sz w:val="7"/>
+              </w:rPr>
+              <w:t>CompleteSocialManualActionRequest</w:t>
+            </w:r>
+          </w:p>
+        </w:tc>
+        <w:tc>
+          <w:tcPr>
+            <w:tcW w:type="dxa" w:w="4008"/>
+          </w:tcPr>
+          <w:p>
+            <w:pPr>
+              <w:spacing w:after="0"/>
+            </w:pPr>
+            <w:r>
+              <w:rPr>
+                <w:sz w:val="7"/>
+              </w:rPr>
+              <w:t>System 07 / Social Manual Action + Audit</w:t>
+            </w:r>
+          </w:p>
+        </w:tc>
+      </w:tr>
+      <w:tr>
+        <w:tc>
+          <w:tcPr>
+            <w:tcW w:type="dxa" w:w="4008"/>
+          </w:tcPr>
+          <w:p>
+            <w:pPr>
+              <w:spacing w:after="0"/>
+            </w:pPr>
+            <w:r>
+              <w:rPr>
+                <w:sz w:val="7"/>
+              </w:rPr>
+              <w:t>SOC-01-BTN-PLATFORM-CONFIG</w:t>
+            </w:r>
+          </w:p>
+        </w:tc>
+        <w:tc>
+          <w:tcPr>
+            <w:tcW w:type="dxa" w:w="4008"/>
+          </w:tcPr>
+          <w:p>
+            <w:pPr>
+              <w:spacing w:after="0"/>
+            </w:pPr>
+            <w:r>
+              <w:rPr>
+                <w:sz w:val="7"/>
+              </w:rPr>
+              <w:t>configureGovernedResource</w:t>
+            </w:r>
+          </w:p>
+        </w:tc>
+        <w:tc>
+          <w:tcPr>
+            <w:tcW w:type="dxa" w:w="4008"/>
+          </w:tcPr>
+          <w:p>
+            <w:pPr>
+              <w:spacing w:after="0"/>
+            </w:pPr>
+            <w:r>
+              <w:rPr>
+                <w:sz w:val="7"/>
+              </w:rPr>
+              <w:t>ConfigureGovernedResourceRequest</w:t>
+            </w:r>
+          </w:p>
+        </w:tc>
+        <w:tc>
+          <w:tcPr>
+            <w:tcW w:type="dxa" w:w="4008"/>
+          </w:tcPr>
+          <w:p>
+            <w:pPr>
+              <w:spacing w:after="0"/>
+            </w:pPr>
+            <w:r>
+              <w:rPr>
+                <w:sz w:val="7"/>
+              </w:rPr>
+              <w:t>Resolved Governed Resource Canonical Owner + Governance Audit</w:t>
+            </w:r>
+          </w:p>
+        </w:tc>
+      </w:tr>
+      <w:tr>
+        <w:tc>
+          <w:tcPr>
+            <w:tcW w:type="dxa" w:w="4008"/>
+          </w:tcPr>
+          <w:p>
+            <w:pPr>
+              <w:spacing w:after="0"/>
+            </w:pPr>
+            <w:r>
+              <w:rPr>
+                <w:sz w:val="7"/>
+              </w:rPr>
+              <w:t>SOC-01-BTN-POLICY-CONFIG</w:t>
+            </w:r>
+          </w:p>
+        </w:tc>
+        <w:tc>
+          <w:tcPr>
+            <w:tcW w:type="dxa" w:w="4008"/>
+          </w:tcPr>
+          <w:p>
+            <w:pPr>
+              <w:spacing w:after="0"/>
+            </w:pPr>
+            <w:r>
+              <w:rPr>
+                <w:sz w:val="7"/>
+              </w:rPr>
+              <w:t>configureSocialTargetPolicy</w:t>
+            </w:r>
+          </w:p>
+        </w:tc>
+        <w:tc>
+          <w:tcPr>
+            <w:tcW w:type="dxa" w:w="4008"/>
+          </w:tcPr>
+          <w:p>
+            <w:pPr>
+              <w:spacing w:after="0"/>
+            </w:pPr>
+            <w:r>
+              <w:rPr>
+                <w:sz w:val="7"/>
+              </w:rPr>
+              <w:t>ConfigureSocialTargetPolicyRequest</w:t>
+            </w:r>
+          </w:p>
+        </w:tc>
+        <w:tc>
+          <w:tcPr>
+            <w:tcW w:type="dxa" w:w="4008"/>
+          </w:tcPr>
+          <w:p>
+            <w:pPr>
+              <w:spacing w:after="0"/>
+            </w:pPr>
+            <w:r>
+              <w:rPr>
+                <w:sz w:val="7"/>
+              </w:rPr>
+              <w:t>System 07 / Social Target Posting Policy + Audit</w:t>
+            </w:r>
+          </w:p>
+        </w:tc>
+      </w:tr>
+      <w:tr>
+        <w:tc>
+          <w:tcPr>
+            <w:tcW w:type="dxa" w:w="4008"/>
+          </w:tcPr>
+          <w:p>
+            <w:pPr>
+              <w:spacing w:after="0"/>
+            </w:pPr>
+            <w:r>
+              <w:rPr>
+                <w:sz w:val="7"/>
+              </w:rPr>
+              <w:t>SOC-01-BTN-PUBLISH</w:t>
+            </w:r>
+          </w:p>
+        </w:tc>
+        <w:tc>
+          <w:tcPr>
+            <w:tcW w:type="dxa" w:w="4008"/>
+          </w:tcPr>
+          <w:p>
+            <w:pPr>
+              <w:spacing w:after="0"/>
+            </w:pPr>
+            <w:r>
+              <w:rPr>
+                <w:sz w:val="7"/>
+              </w:rPr>
+              <w:t>requestSocialTargetPublish</w:t>
+            </w:r>
+          </w:p>
+        </w:tc>
+        <w:tc>
+          <w:tcPr>
+            <w:tcW w:type="dxa" w:w="4008"/>
+          </w:tcPr>
+          <w:p>
+            <w:pPr>
+              <w:spacing w:after="0"/>
+            </w:pPr>
+            <w:r>
+              <w:rPr>
+                <w:sz w:val="7"/>
+              </w:rPr>
+              <w:t>SocialTargetPublishRequest</w:t>
+            </w:r>
+          </w:p>
+        </w:tc>
+        <w:tc>
+          <w:tcPr>
+            <w:tcW w:type="dxa" w:w="4008"/>
+          </w:tcPr>
+          <w:p>
+            <w:pPr>
+              <w:spacing w:after="0"/>
+            </w:pPr>
+            <w:r>
+              <w:rPr>
+                <w:sz w:val="7"/>
+              </w:rPr>
+              <w:t>System 07 / PublishRequest + Target Publish State + Audit</w:t>
+            </w:r>
+          </w:p>
+        </w:tc>
+      </w:tr>
+      <w:tr>
+        <w:tc>
+          <w:tcPr>
+            <w:tcW w:type="dxa" w:w="4008"/>
+          </w:tcPr>
+          <w:p>
+            <w:pPr>
+              <w:spacing w:after="0"/>
+            </w:pPr>
+            <w:r>
+              <w:rPr>
+                <w:sz w:val="7"/>
+              </w:rPr>
+              <w:t>SOC-01-BTN-REFRESH</w:t>
+            </w:r>
+          </w:p>
+        </w:tc>
+        <w:tc>
+          <w:tcPr>
+            <w:tcW w:type="dxa" w:w="4008"/>
+          </w:tcPr>
+          <w:p>
+            <w:pPr>
+              <w:spacing w:after="0"/>
+            </w:pPr>
+            <w:r>
+              <w:rPr>
+                <w:sz w:val="7"/>
+              </w:rPr>
+              <w:t>refreshProjection</w:t>
+            </w:r>
+          </w:p>
+        </w:tc>
+        <w:tc>
+          <w:tcPr>
+            <w:tcW w:type="dxa" w:w="4008"/>
+          </w:tcPr>
+          <w:p>
+            <w:pPr>
+              <w:spacing w:after="0"/>
+            </w:pPr>
+            <w:r>
+              <w:rPr>
+                <w:sz w:val="7"/>
+              </w:rPr>
+              <w:t>RefreshSocialProjectionRequest</w:t>
+            </w:r>
+          </w:p>
+        </w:tc>
+        <w:tc>
+          <w:tcPr>
+            <w:tcW w:type="dxa" w:w="4008"/>
+          </w:tcPr>
+          <w:p>
+            <w:pPr>
+              <w:spacing w:after="0"/>
+            </w:pPr>
+            <w:r>
+              <w:rPr>
+                <w:sz w:val="7"/>
+              </w:rPr>
+              <w:t>System 07 / Social Projection + Projection Audit</w:t>
+            </w:r>
+          </w:p>
+        </w:tc>
+      </w:tr>
+      <w:tr>
+        <w:tc>
+          <w:tcPr>
+            <w:tcW w:type="dxa" w:w="4008"/>
+          </w:tcPr>
+          <w:p>
+            <w:pPr>
+              <w:spacing w:after="0"/>
+            </w:pPr>
+            <w:r>
+              <w:rPr>
+                <w:sz w:val="7"/>
+              </w:rPr>
+              <w:t>SOC-01-BTN-TARGET-DISCOVERY</w:t>
+            </w:r>
+          </w:p>
+        </w:tc>
+        <w:tc>
+          <w:tcPr>
+            <w:tcW w:type="dxa" w:w="4008"/>
+          </w:tcPr>
+          <w:p>
+            <w:pPr>
+              <w:spacing w:after="0"/>
+            </w:pPr>
+            <w:r>
+              <w:rPr>
+                <w:sz w:val="7"/>
+              </w:rPr>
+              <w:t>createSocialTargetDiscovery</w:t>
+            </w:r>
+          </w:p>
+        </w:tc>
+        <w:tc>
+          <w:tcPr>
+            <w:tcW w:type="dxa" w:w="4008"/>
+          </w:tcPr>
+          <w:p>
+            <w:pPr>
+              <w:spacing w:after="0"/>
+            </w:pPr>
+            <w:r>
+              <w:rPr>
+                <w:sz w:val="7"/>
+              </w:rPr>
+              <w:t>CreateSocialTargetDiscoveryRequest</w:t>
+            </w:r>
+          </w:p>
+        </w:tc>
+        <w:tc>
+          <w:tcPr>
+            <w:tcW w:type="dxa" w:w="4008"/>
+          </w:tcPr>
+          <w:p>
+            <w:pPr>
+              <w:spacing w:after="0"/>
+            </w:pPr>
+            <w:r>
+              <w:rPr>
+                <w:sz w:val="7"/>
+              </w:rPr>
+              <w:t>System 07 / SocialTargetDiscoveryJob + Discovery Evidence</w:t>
+            </w:r>
+          </w:p>
+        </w:tc>
+      </w:tr>
+      <w:tr>
+        <w:tc>
+          <w:tcPr>
+            <w:tcW w:type="dxa" w:w="4008"/>
+          </w:tcPr>
+          <w:p>
+            <w:pPr>
+              <w:spacing w:after="0"/>
+            </w:pPr>
+            <w:r>
+              <w:rPr>
+                <w:sz w:val="7"/>
+              </w:rPr>
+              <w:t>SOC-01-BTN-TARGET-JOIN</w:t>
+            </w:r>
+          </w:p>
+        </w:tc>
+        <w:tc>
+          <w:tcPr>
+            <w:tcW w:type="dxa" w:w="4008"/>
+          </w:tcPr>
+          <w:p>
+            <w:pPr>
+              <w:spacing w:after="0"/>
+            </w:pPr>
+            <w:r>
+              <w:rPr>
+                <w:sz w:val="7"/>
+              </w:rPr>
+              <w:t>requestSocialTargetJoin</w:t>
+            </w:r>
+          </w:p>
+        </w:tc>
+        <w:tc>
+          <w:tcPr>
+            <w:tcW w:type="dxa" w:w="4008"/>
+          </w:tcPr>
+          <w:p>
+            <w:pPr>
+              <w:spacing w:after="0"/>
+            </w:pPr>
+            <w:r>
+              <w:rPr>
+                <w:sz w:val="7"/>
+              </w:rPr>
+              <w:t>SocialTargetJoinRequest</w:t>
+            </w:r>
+          </w:p>
+        </w:tc>
+        <w:tc>
+          <w:tcPr>
+            <w:tcW w:type="dxa" w:w="4008"/>
+          </w:tcPr>
+          <w:p>
+            <w:pPr>
+              <w:spacing w:after="0"/>
+            </w:pPr>
+            <w:r>
+              <w:rPr>
+                <w:sz w:val="7"/>
+              </w:rPr>
+              <w:t>System 07 / Social Target Join Request + Audit</w:t>
+            </w:r>
+          </w:p>
+        </w:tc>
+      </w:tr>
+      <w:tr>
+        <w:tc>
+          <w:tcPr>
+            <w:tcW w:type="dxa" w:w="4008"/>
+          </w:tcPr>
+          <w:p>
+            <w:pPr>
+              <w:spacing w:after="0"/>
+            </w:pPr>
+            <w:r>
+              <w:rPr>
+                <w:sz w:val="7"/>
+              </w:rPr>
+              <w:t>SOC-01-INP-RECORD-SEARCH</w:t>
+            </w:r>
+          </w:p>
+        </w:tc>
+        <w:tc>
+          <w:tcPr>
+            <w:tcW w:type="dxa" w:w="4008"/>
+          </w:tcPr>
+          <w:p>
+            <w:pPr>
+              <w:spacing w:after="0"/>
+            </w:pPr>
+            <w:r>
+              <w:rPr>
+                <w:sz w:val="7"/>
+              </w:rPr>
+              <w:t>searchProjection</w:t>
+            </w:r>
+          </w:p>
+        </w:tc>
+        <w:tc>
+          <w:tcPr>
+            <w:tcW w:type="dxa" w:w="4008"/>
+          </w:tcPr>
+          <w:p>
+            <w:pPr>
+              <w:spacing w:after="0"/>
+            </w:pPr>
+            <w:r>
+              <w:rPr>
+                <w:sz w:val="7"/>
+              </w:rPr>
+              <w:t>SearchSocialProjectionRequest</w:t>
+            </w:r>
+          </w:p>
+        </w:tc>
+        <w:tc>
+          <w:tcPr>
+            <w:tcW w:type="dxa" w:w="4008"/>
+          </w:tcPr>
+          <w:p>
+            <w:pPr>
+              <w:spacing w:after="0"/>
+            </w:pPr>
+            <w:r>
+              <w:rPr>
+                <w:sz w:val="7"/>
+              </w:rPr>
+              <w:t>System 07 / Search Projection Result + Search Audit</w:t>
+            </w:r>
+          </w:p>
+        </w:tc>
+      </w:tr>
+      <w:tr>
+        <w:tc>
+          <w:tcPr>
+            <w:tcW w:type="dxa" w:w="4008"/>
+          </w:tcPr>
+          <w:p>
+            <w:pPr>
+              <w:spacing w:after="0"/>
+            </w:pPr>
+            <w:r>
+              <w:rPr>
+                <w:sz w:val="7"/>
+              </w:rPr>
+              <w:t>SOC-01-INP-TARGET-SEARCH</w:t>
+            </w:r>
+          </w:p>
+        </w:tc>
+        <w:tc>
+          <w:tcPr>
+            <w:tcW w:type="dxa" w:w="4008"/>
+          </w:tcPr>
+          <w:p>
+            <w:pPr>
+              <w:spacing w:after="0"/>
+            </w:pPr>
+            <w:r>
+              <w:rPr>
+                <w:sz w:val="7"/>
+              </w:rPr>
+              <w:t>searchProjection</w:t>
+            </w:r>
+          </w:p>
+        </w:tc>
+        <w:tc>
+          <w:tcPr>
+            <w:tcW w:type="dxa" w:w="4008"/>
+          </w:tcPr>
+          <w:p>
+            <w:pPr>
+              <w:spacing w:after="0"/>
+            </w:pPr>
+            <w:r>
+              <w:rPr>
+                <w:sz w:val="7"/>
+              </w:rPr>
+              <w:t>SearchSocialProjectionRequest</w:t>
+            </w:r>
+          </w:p>
+        </w:tc>
+        <w:tc>
+          <w:tcPr>
+            <w:tcW w:type="dxa" w:w="4008"/>
+          </w:tcPr>
+          <w:p>
+            <w:pPr>
+              <w:spacing w:after="0"/>
+            </w:pPr>
+            <w:r>
+              <w:rPr>
+                <w:sz w:val="7"/>
+              </w:rPr>
+              <w:t>System 07 / Search Projection Result + Search Audit</w:t>
+            </w:r>
+          </w:p>
+        </w:tc>
+      </w:tr>
+    </w:tbl>
     <w:sectPr>
-      <w:pgSz w:w="11906" w:h="16838" w:orient="landscape"/>
-      <w:pgMar w:top="576" w:right="504" w:bottom="576" w:left="504" w:header="283" w:footer="283" w:gutter="0"/>
+      <w:pgSz w:w="16838" w:h="11906" w:orient="landscape"/>
+      <w:pgMar w:top="475" w:right="403" w:bottom="475" w:left="403" w:header="283" w:footer="283" w:gutter="0"/>
       <w:cols w:space="720"/>
       <w:docGrid w:linePitch="360"/>
     </w:sectPr>

</xml_diff>